<commit_message>
Guard: allowed repo is PraveenBanneka/team-kestrel-zedpath (renamed 2026-10-06), exact-name match so lookalikes stay blocked; guard tests updated (40/40). Presentation renamed to Kestrel_Final_Presentation.pdf; business case Final docx updated
Co-Authored-By: Claude Opus 5.5 (1M context) <noreply@anthropic.com>
</commit_message>
<xml_diff>
--- a/ZedPath_Business_Case_Final.docx
+++ b/ZedPath_Business_Case_Final.docx
@@ -111,8 +111,16 @@
         <w:pStyle w:val="Heading2"/>
         <w:keepLines/>
         <w:pageBreakBefore/>
-      </w:pPr>
-      <w:r>
+        <w:rPr>
+          <w:sz w:val="32"/>
+          <w:szCs w:val="32"/>
+        </w:rPr>
+      </w:pPr>
+      <w:r>
+        <w:rPr>
+          <w:sz w:val="32"/>
+          <w:szCs w:val="32"/>
+        </w:rPr>
         <w:lastRenderedPageBreak/>
         <w:t>1. The problem</w:t>
       </w:r>
@@ -138,7 +146,10 @@
         <w:spacing w:after="80"/>
       </w:pPr>
       <w:r>
-        <w:t>The other paths run on their own calendars:</w:t>
+        <w:t xml:space="preserve">The </w:t>
+      </w:r>
+      <w:r>
+        <w:t>paths run on their own calendars:</w:t>
       </w:r>
     </w:p>
     <w:p>
@@ -626,20 +637,19 @@
     </w:p>
     <w:p>
       <w:pPr>
-        <w:pStyle w:val="ListParagraph"/>
-        <w:numPr>
-          <w:ilvl w:val="0"/>
-          <w:numId w:val="2"/>
-        </w:numPr>
-        <w:spacing w:after="80"/>
-      </w:pPr>
-    </w:p>
-    <w:p>
-      <w:pPr>
-        <w:spacing w:after="80"/>
-      </w:pPr>
-      <w:r>
-        <w:t>The National Education Commission found most students and parents unaware of alternative education and career options [3], and school guidance "more substantial on paper than in reality", especially in rural areas.</w:t>
+        <w:spacing w:after="80"/>
+        <w:ind w:left="360"/>
+      </w:pPr>
+    </w:p>
+    <w:p>
+      <w:pPr>
+        <w:spacing w:after="80"/>
+      </w:pPr>
+      <w:r>
+        <w:t>T</w:t>
+      </w:r>
+      <w:r>
+        <w:t>he National Education Commission found most students and parents unaware of alternative education and career options [3], and school guidance "more substantial on paper than in reality", especially in rural areas.</w:t>
       </w:r>
     </w:p>
     <w:p>
@@ -1029,8 +1039,16 @@
       <w:pPr>
         <w:pStyle w:val="Heading2"/>
         <w:keepLines/>
-      </w:pPr>
-      <w:r>
+        <w:rPr>
+          <w:sz w:val="32"/>
+          <w:szCs w:val="32"/>
+        </w:rPr>
+      </w:pPr>
+      <w:r>
+        <w:rPr>
+          <w:sz w:val="32"/>
+          <w:szCs w:val="32"/>
+        </w:rPr>
         <w:t>2. Proposed solution: ZedPath</w:t>
       </w:r>
     </w:p>
@@ -1052,7 +1070,13 @@
         <w:spacing w:after="80"/>
       </w:pPr>
       <w:r>
-        <w:t>ZedPath is a free, trilingual web and Android app. It rates every state course Safe, Likely or Reach from five years of district cut-offs and lists the other paths. It checks the student's preference order and tracks deadlines with reminders. Ask ZedPath, its AI assistant, answers in Sinhala, Tamil or English only from the official sources it retrieves, and every answer shows the page it came from so the student can check it.</w:t>
+        <w:t xml:space="preserve">ZedPath is a free, trilingual web </w:t>
+      </w:r>
+      <w:r>
+        <w:t>that also comes as a native</w:t>
+      </w:r>
+      <w:r>
+        <w:t xml:space="preserve"> app. It rates every state course Safe, Likely or Reach from five years of district cut-offs and lists the other paths. It checks the student's preference order and tracks deadlines with reminders. Ask ZedPath, its AI assistant, answers in Sinhala, Tamil or English only from the official sources it retrieves, and every answer shows the page it came from so the student can check it.</w:t>
       </w:r>
     </w:p>
     <w:tbl>
@@ -1085,592 +1109,592 @@
               <w:rPr>
                 <w:sz w:val="18"/>
               </w:rPr>
+              <w:t>Feature</w:t>
+            </w:r>
+          </w:p>
+        </w:tc>
+        <w:tc>
+          <w:tcPr>
+            <w:tcW w:w="3120" w:type="dxa"/>
+            <w:shd w:val="clear" w:color="auto" w:fill="F2F2F2"/>
+          </w:tcPr>
+          <w:p>
+            <w:pPr>
+              <w:spacing w:after="0"/>
+            </w:pPr>
+            <w:r>
+              <w:rPr>
+                <w:sz w:val="18"/>
+              </w:rPr>
+              <w:t>What the student gets</w:t>
+            </w:r>
+          </w:p>
+        </w:tc>
+        <w:tc>
+          <w:tcPr>
+            <w:tcW w:w="3120" w:type="dxa"/>
+            <w:shd w:val="clear" w:color="auto" w:fill="F2F2F2"/>
+          </w:tcPr>
+          <w:p>
+            <w:pPr>
+              <w:spacing w:after="0"/>
+            </w:pPr>
+            <w:r>
+              <w:rPr>
+                <w:sz w:val="18"/>
+              </w:rPr>
+              <w:t>Problem it removes</w:t>
+            </w:r>
+          </w:p>
+        </w:tc>
+      </w:tr>
+      <w:tr>
+        <w:trPr>
+          <w:cantSplit/>
+        </w:trPr>
+        <w:tc>
+          <w:tcPr>
+            <w:tcW w:w="3120" w:type="dxa"/>
+          </w:tcPr>
+          <w:p>
+            <w:pPr>
+              <w:spacing w:after="0"/>
+            </w:pPr>
+            <w:r>
+              <w:rPr>
+                <w:sz w:val="18"/>
+              </w:rPr>
+              <w:t>Enter results once</w:t>
+            </w:r>
+          </w:p>
+        </w:tc>
+        <w:tc>
+          <w:tcPr>
+            <w:tcW w:w="3120" w:type="dxa"/>
+          </w:tcPr>
+          <w:p>
+            <w:pPr>
+              <w:spacing w:after="0"/>
+            </w:pPr>
+            <w:r>
+              <w:rPr>
+                <w:sz w:val="18"/>
+              </w:rPr>
+              <w:t>Stream, district, Z-score and subject grades, entered one time and reused everywhere</w:t>
+            </w:r>
+          </w:p>
+        </w:tc>
+        <w:tc>
+          <w:tcPr>
+            <w:tcW w:w="3120" w:type="dxa"/>
+          </w:tcPr>
+          <w:p>
+            <w:pPr>
+              <w:spacing w:after="0"/>
+            </w:pPr>
+            <w:r>
+              <w:rPr>
+                <w:sz w:val="18"/>
+              </w:rPr>
+              <w:t>Re-checking the same facts on every site</w:t>
+            </w:r>
+          </w:p>
+        </w:tc>
+      </w:tr>
+      <w:tr>
+        <w:trPr>
+          <w:cantSplit/>
+        </w:trPr>
+        <w:tc>
+          <w:tcPr>
+            <w:tcW w:w="3120" w:type="dxa"/>
+          </w:tcPr>
+          <w:p>
+            <w:pPr>
+              <w:spacing w:after="0"/>
+            </w:pPr>
+            <w:r>
+              <w:rPr>
+                <w:sz w:val="18"/>
+              </w:rPr>
+              <w:t>Every path</w:t>
+            </w:r>
+          </w:p>
+        </w:tc>
+        <w:tc>
+          <w:tcPr>
+            <w:tcW w:w="3120" w:type="dxa"/>
+          </w:tcPr>
+          <w:p>
+            <w:pPr>
+              <w:spacing w:after="0"/>
+            </w:pPr>
+            <w:r>
+              <w:rPr>
+                <w:sz w:val="18"/>
+              </w:rPr>
+              <w:t>All 255 state course codes (Uni-Codes) rated Safe, Likely or Reach from five years of district cut-offs [2][6], beside private degrees, job exams, vocational courses, study abroad, etc.</w:t>
+            </w:r>
+          </w:p>
+        </w:tc>
+        <w:tc>
+          <w:tcPr>
+            <w:tcW w:w="3120" w:type="dxa"/>
+          </w:tcPr>
+          <w:p>
+            <w:pPr>
+              <w:spacing w:after="0"/>
+            </w:pPr>
+            <w:r>
+              <w:rPr>
+                <w:sz w:val="18"/>
+              </w:rPr>
+              <w:t>Not knowing the other paths</w:t>
+            </w:r>
+          </w:p>
+        </w:tc>
+      </w:tr>
+      <w:tr>
+        <w:trPr>
+          <w:cantSplit/>
+        </w:trPr>
+        <w:tc>
+          <w:tcPr>
+            <w:tcW w:w="3120" w:type="dxa"/>
+          </w:tcPr>
+          <w:p>
+            <w:pPr>
+              <w:spacing w:after="0"/>
+            </w:pPr>
+            <w:r>
+              <w:rPr>
+                <w:sz w:val="18"/>
+              </w:rPr>
+              <w:t>Course pages</w:t>
+            </w:r>
+          </w:p>
+        </w:tc>
+        <w:tc>
+          <w:tcPr>
+            <w:tcW w:w="3120" w:type="dxa"/>
+          </w:tcPr>
+          <w:p>
+            <w:pPr>
+              <w:spacing w:after="0"/>
+            </w:pPr>
+            <w:r>
+              <w:rPr>
+                <w:sz w:val="18"/>
+              </w:rPr>
+              <w:t>Entry rules checked against the student's own grades, aptitude-test flags, the cut-off history and the official syllabus</w:t>
+            </w:r>
+          </w:p>
+        </w:tc>
+        <w:tc>
+          <w:tcPr>
+            <w:tcW w:w="3120" w:type="dxa"/>
+          </w:tcPr>
+          <w:p>
+            <w:pPr>
+              <w:spacing w:after="0"/>
+            </w:pPr>
+            <w:r>
+              <w:rPr>
+                <w:sz w:val="18"/>
+              </w:rPr>
+              <w:t>Ineligible choices; "what does this degree teach?"</w:t>
+            </w:r>
+          </w:p>
+        </w:tc>
+      </w:tr>
+      <w:tr>
+        <w:trPr>
+          <w:cantSplit/>
+        </w:trPr>
+        <w:tc>
+          <w:tcPr>
+            <w:tcW w:w="3120" w:type="dxa"/>
+          </w:tcPr>
+          <w:p>
+            <w:pPr>
+              <w:spacing w:after="0"/>
+            </w:pPr>
+            <w:r>
+              <w:rPr>
+                <w:sz w:val="18"/>
+              </w:rPr>
+              <w:t>My list</w:t>
+            </w:r>
+          </w:p>
+        </w:tc>
+        <w:tc>
+          <w:tcPr>
+            <w:tcW w:w="3120" w:type="dxa"/>
+          </w:tcPr>
+          <w:p>
+            <w:pPr>
+              <w:spacing w:after="0"/>
+            </w:pPr>
+            <w:r>
+              <w:rPr>
+                <w:sz w:val="18"/>
+              </w:rPr>
+              <w:t>The UGC preference list (up to 125 courses), with warnings when the order blocks a course the student wants more</w:t>
+            </w:r>
+          </w:p>
+        </w:tc>
+        <w:tc>
+          <w:tcPr>
+            <w:tcW w:w="3120" w:type="dxa"/>
+          </w:tcPr>
+          <w:p>
+            <w:pPr>
+              <w:spacing w:after="0"/>
+            </w:pPr>
+            <w:r>
+              <w:rPr>
+                <w:sz w:val="18"/>
+              </w:rPr>
+              <w:t>A badly ordered list</w:t>
+            </w:r>
+          </w:p>
+        </w:tc>
+      </w:tr>
+      <w:tr>
+        <w:trPr>
+          <w:cantSplit/>
+        </w:trPr>
+        <w:tc>
+          <w:tcPr>
+            <w:tcW w:w="3120" w:type="dxa"/>
+          </w:tcPr>
+          <w:p>
+            <w:pPr>
+              <w:spacing w:after="0"/>
+            </w:pPr>
+            <w:r>
+              <w:rPr>
+                <w:sz w:val="18"/>
+              </w:rPr>
+              <w:t>Compare</w:t>
+            </w:r>
+          </w:p>
+        </w:tc>
+        <w:tc>
+          <w:tcPr>
+            <w:tcW w:w="3120" w:type="dxa"/>
+          </w:tcPr>
+          <w:p>
+            <w:pPr>
+              <w:spacing w:after="0"/>
+            </w:pPr>
+            <w:r>
+              <w:rPr>
+                <w:sz w:val="18"/>
+              </w:rPr>
+              <w:t>Up to three courses side by side: chance, length, first-year subjects, extra steps</w:t>
+            </w:r>
+          </w:p>
+        </w:tc>
+        <w:tc>
+          <w:tcPr>
+            <w:tcW w:w="3120" w:type="dxa"/>
+          </w:tcPr>
+          <w:p>
+            <w:pPr>
+              <w:spacing w:after="0"/>
+            </w:pPr>
+            <w:r>
+              <w:rPr>
+                <w:sz w:val="18"/>
+              </w:rPr>
+              <w:t>Choosing between degrees blind</w:t>
+            </w:r>
+          </w:p>
+        </w:tc>
+      </w:tr>
+      <w:tr>
+        <w:trPr>
+          <w:cantSplit/>
+        </w:trPr>
+        <w:tc>
+          <w:tcPr>
+            <w:tcW w:w="3120" w:type="dxa"/>
+          </w:tcPr>
+          <w:p>
+            <w:pPr>
+              <w:spacing w:after="0"/>
+            </w:pPr>
+            <w:r>
+              <w:rPr>
+                <w:sz w:val="18"/>
+              </w:rPr>
+              <w:t>Ask ZedPath</w:t>
+            </w:r>
+          </w:p>
+        </w:tc>
+        <w:tc>
+          <w:tcPr>
+            <w:tcW w:w="3120" w:type="dxa"/>
+          </w:tcPr>
+          <w:p>
+            <w:pPr>
+              <w:spacing w:after="0"/>
+            </w:pPr>
+            <w:r>
+              <w:rPr>
+                <w:sz w:val="18"/>
+              </w:rPr>
+              <w:t>Questions answered in Sinhala, Tamil or English from the UGC handbook and official pages, each answer citing its page and linking to the official source to check; off-topic questions refused</w:t>
+            </w:r>
+          </w:p>
+        </w:tc>
+        <w:tc>
+          <w:tcPr>
+            <w:tcW w:w="3120" w:type="dxa"/>
+          </w:tcPr>
+          <w:p>
+            <w:pPr>
+              <w:spacing w:after="0"/>
+            </w:pPr>
+            <w:r>
+              <w:rPr>
+                <w:sz w:val="18"/>
+              </w:rPr>
+              <w:t>Hearsay and unreadable handbooks</w:t>
+            </w:r>
+          </w:p>
+        </w:tc>
+      </w:tr>
+      <w:tr>
+        <w:trPr>
+          <w:cantSplit/>
+        </w:trPr>
+        <w:tc>
+          <w:tcPr>
+            <w:tcW w:w="3120" w:type="dxa"/>
+          </w:tcPr>
+          <w:p>
+            <w:pPr>
+              <w:spacing w:after="0"/>
+            </w:pPr>
+            <w:r>
+              <w:rPr>
+                <w:sz w:val="18"/>
+              </w:rPr>
+              <w:t>Gazette alerts</w:t>
+            </w:r>
+          </w:p>
+        </w:tc>
+        <w:tc>
+          <w:tcPr>
+            <w:tcW w:w="3120" w:type="dxa"/>
+          </w:tcPr>
+          <w:p>
+            <w:pPr>
+              <w:spacing w:after="0"/>
+            </w:pPr>
+            <w:r>
+              <w:rPr>
+                <w:sz w:val="18"/>
+              </w:rPr>
+              <w:t>Every weekly Gazette read; a new job exam the student qualifies for becomes an alert with its closing date</w:t>
+            </w:r>
+          </w:p>
+        </w:tc>
+        <w:tc>
+          <w:tcPr>
+            <w:tcW w:w="3120" w:type="dxa"/>
+          </w:tcPr>
+          <w:p>
+            <w:pPr>
+              <w:spacing w:after="0"/>
+            </w:pPr>
+            <w:r>
+              <w:rPr>
+                <w:sz w:val="18"/>
+              </w:rPr>
+              <w:t>Missing job exams</w:t>
+            </w:r>
+          </w:p>
+        </w:tc>
+      </w:tr>
+      <w:tr>
+        <w:trPr>
+          <w:cantSplit/>
+        </w:trPr>
+        <w:tc>
+          <w:tcPr>
+            <w:tcW w:w="3120" w:type="dxa"/>
+          </w:tcPr>
+          <w:p>
+            <w:pPr>
+              <w:spacing w:after="0"/>
+            </w:pPr>
+            <w:r>
+              <w:rPr>
+                <w:sz w:val="18"/>
+              </w:rPr>
+              <w:t>Journey and reminders</w:t>
+            </w:r>
+          </w:p>
+        </w:tc>
+        <w:tc>
+          <w:tcPr>
+            <w:tcW w:w="3120" w:type="dxa"/>
+          </w:tcPr>
+          <w:p>
+            <w:pPr>
+              <w:spacing w:after="0"/>
+            </w:pPr>
+            <w:r>
+              <w:rPr>
+                <w:sz w:val="18"/>
+              </w:rPr>
+              <w:t>Every step from results to registration, marked confirmed or estimated, with reminders as phone notifications</w:t>
+            </w:r>
+          </w:p>
+        </w:tc>
+        <w:tc>
+          <w:tcPr>
+            <w:tcW w:w="3120" w:type="dxa"/>
+          </w:tcPr>
+          <w:p>
+            <w:pPr>
+              <w:spacing w:after="0"/>
+            </w:pPr>
+            <w:r>
+              <w:rPr>
+                <w:sz w:val="18"/>
+              </w:rPr>
+              <w:t>Missed windows and later rounds</w:t>
+            </w:r>
+          </w:p>
+        </w:tc>
+      </w:tr>
+      <w:tr>
+        <w:trPr>
+          <w:cantSplit/>
+        </w:trPr>
+        <w:tc>
+          <w:tcPr>
+            <w:tcW w:w="3120" w:type="dxa"/>
+          </w:tcPr>
+          <w:p>
+            <w:pPr>
+              <w:spacing w:after="0"/>
+            </w:pPr>
+            <w:r>
+              <w:rPr>
+                <w:sz w:val="18"/>
+              </w:rPr>
+              <w:t>Course groups</w:t>
+            </w:r>
+          </w:p>
+        </w:tc>
+        <w:tc>
+          <w:tcPr>
+            <w:tcW w:w="3120" w:type="dxa"/>
+          </w:tcPr>
+          <w:p>
+            <w:pPr>
+              <w:spacing w:after="0"/>
+            </w:pPr>
+            <w:r>
+              <w:rPr>
+                <w:sz w:val="18"/>
+              </w:rPr>
+              <w:t>A group per target course, verified seniors marked with a badge, report and block on every message</w:t>
+            </w:r>
+          </w:p>
+        </w:tc>
+        <w:tc>
+          <w:tcPr>
+            <w:tcW w:w="3120" w:type="dxa"/>
+          </w:tcPr>
+          <w:p>
+            <w:pPr>
+              <w:spacing w:after="0"/>
+            </w:pPr>
+            <w:r>
+              <w:rPr>
+                <w:sz w:val="18"/>
+              </w:rPr>
+              <w:t>Unverified Facebook advice</w:t>
+            </w:r>
+          </w:p>
+        </w:tc>
+      </w:tr>
+      <w:tr>
+        <w:trPr>
+          <w:cantSplit/>
+        </w:trPr>
+        <w:tc>
+          <w:tcPr>
+            <w:tcW w:w="3120" w:type="dxa"/>
+          </w:tcPr>
+          <w:p>
+            <w:pPr>
+              <w:spacing w:after="0"/>
+            </w:pPr>
+            <w:r>
+              <w:rPr>
+                <w:sz w:val="18"/>
+              </w:rPr>
+              <w:t>Three languages</w:t>
+            </w:r>
+          </w:p>
+        </w:tc>
+        <w:tc>
+          <w:tcPr>
+            <w:tcW w:w="3120" w:type="dxa"/>
+          </w:tcPr>
+          <w:p>
+            <w:pPr>
+              <w:spacing w:after="0"/>
+            </w:pPr>
+            <w:r>
+              <w:rPr>
+                <w:sz w:val="18"/>
+              </w:rPr>
+              <w:t>The whole interface in Sinhala, Tamil and English, reviewed by native speakers</w:t>
+            </w:r>
+          </w:p>
+        </w:tc>
+        <w:tc>
+          <w:tcPr>
+            <w:tcW w:w="3120" w:type="dxa"/>
+          </w:tcPr>
+          <w:p>
+            <w:pPr>
+              <w:spacing w:after="0"/>
+            </w:pPr>
+            <w:r>
+              <w:rPr>
+                <w:sz w:val="18"/>
+              </w:rPr>
+              <w:t>English-only tools</w:t>
+            </w:r>
+          </w:p>
+        </w:tc>
+      </w:tr>
+      <w:tr>
+        <w:trPr>
+          <w:cantSplit/>
+        </w:trPr>
+        <w:tc>
+          <w:tcPr>
+            <w:tcW w:w="3120" w:type="dxa"/>
+          </w:tcPr>
+          <w:p>
+            <w:pPr>
+              <w:spacing w:after="0"/>
+            </w:pPr>
+            <w:r>
+              <w:rPr>
+                <w:sz w:val="18"/>
+              </w:rPr>
               <w:lastRenderedPageBreak/>
-              <w:t>Feature</w:t>
-            </w:r>
-          </w:p>
-        </w:tc>
-        <w:tc>
-          <w:tcPr>
-            <w:tcW w:w="3120" w:type="dxa"/>
-            <w:shd w:val="clear" w:color="auto" w:fill="F2F2F2"/>
-          </w:tcPr>
-          <w:p>
-            <w:pPr>
-              <w:spacing w:after="0"/>
-            </w:pPr>
-            <w:r>
-              <w:rPr>
-                <w:sz w:val="18"/>
-              </w:rPr>
-              <w:t>What the student gets</w:t>
-            </w:r>
-          </w:p>
-        </w:tc>
-        <w:tc>
-          <w:tcPr>
-            <w:tcW w:w="3120" w:type="dxa"/>
-            <w:shd w:val="clear" w:color="auto" w:fill="F2F2F2"/>
-          </w:tcPr>
-          <w:p>
-            <w:pPr>
-              <w:spacing w:after="0"/>
-            </w:pPr>
-            <w:r>
-              <w:rPr>
-                <w:sz w:val="18"/>
-              </w:rPr>
-              <w:t>Problem it removes</w:t>
-            </w:r>
-          </w:p>
-        </w:tc>
-      </w:tr>
-      <w:tr>
-        <w:trPr>
-          <w:cantSplit/>
-        </w:trPr>
-        <w:tc>
-          <w:tcPr>
-            <w:tcW w:w="3120" w:type="dxa"/>
-          </w:tcPr>
-          <w:p>
-            <w:pPr>
-              <w:spacing w:after="0"/>
-            </w:pPr>
-            <w:r>
-              <w:rPr>
-                <w:sz w:val="18"/>
-              </w:rPr>
-              <w:t>Enter results once</w:t>
-            </w:r>
-          </w:p>
-        </w:tc>
-        <w:tc>
-          <w:tcPr>
-            <w:tcW w:w="3120" w:type="dxa"/>
-          </w:tcPr>
-          <w:p>
-            <w:pPr>
-              <w:spacing w:after="0"/>
-            </w:pPr>
-            <w:r>
-              <w:rPr>
-                <w:sz w:val="18"/>
-              </w:rPr>
-              <w:t>Stream, district, Z-score and subject grades, entered one time and reused everywhere</w:t>
-            </w:r>
-          </w:p>
-        </w:tc>
-        <w:tc>
-          <w:tcPr>
-            <w:tcW w:w="3120" w:type="dxa"/>
-          </w:tcPr>
-          <w:p>
-            <w:pPr>
-              <w:spacing w:after="0"/>
-            </w:pPr>
-            <w:r>
-              <w:rPr>
-                <w:sz w:val="18"/>
-              </w:rPr>
-              <w:t>Re-checking the same facts on every site</w:t>
-            </w:r>
-          </w:p>
-        </w:tc>
-      </w:tr>
-      <w:tr>
-        <w:trPr>
-          <w:cantSplit/>
-        </w:trPr>
-        <w:tc>
-          <w:tcPr>
-            <w:tcW w:w="3120" w:type="dxa"/>
-          </w:tcPr>
-          <w:p>
-            <w:pPr>
-              <w:spacing w:after="0"/>
-            </w:pPr>
-            <w:r>
-              <w:rPr>
-                <w:sz w:val="18"/>
-              </w:rPr>
-              <w:t>Every path</w:t>
-            </w:r>
-          </w:p>
-        </w:tc>
-        <w:tc>
-          <w:tcPr>
-            <w:tcW w:w="3120" w:type="dxa"/>
-          </w:tcPr>
-          <w:p>
-            <w:pPr>
-              <w:spacing w:after="0"/>
-            </w:pPr>
-            <w:r>
-              <w:rPr>
-                <w:sz w:val="18"/>
-              </w:rPr>
-              <w:t>All 255 state course codes (Uni-Codes) rated Safe, Likely or Reach from five years of district cut-offs [2][6], beside private degrees, job exams, vocational courses, study abroad, etc.</w:t>
-            </w:r>
-          </w:p>
-        </w:tc>
-        <w:tc>
-          <w:tcPr>
-            <w:tcW w:w="3120" w:type="dxa"/>
-          </w:tcPr>
-          <w:p>
-            <w:pPr>
-              <w:spacing w:after="0"/>
-            </w:pPr>
-            <w:r>
-              <w:rPr>
-                <w:sz w:val="18"/>
-              </w:rPr>
-              <w:t>Not knowing the other paths</w:t>
-            </w:r>
-          </w:p>
-        </w:tc>
-      </w:tr>
-      <w:tr>
-        <w:trPr>
-          <w:cantSplit/>
-        </w:trPr>
-        <w:tc>
-          <w:tcPr>
-            <w:tcW w:w="3120" w:type="dxa"/>
-          </w:tcPr>
-          <w:p>
-            <w:pPr>
-              <w:spacing w:after="0"/>
-            </w:pPr>
-            <w:r>
-              <w:rPr>
-                <w:sz w:val="18"/>
-              </w:rPr>
-              <w:t>Course pages</w:t>
-            </w:r>
-          </w:p>
-        </w:tc>
-        <w:tc>
-          <w:tcPr>
-            <w:tcW w:w="3120" w:type="dxa"/>
-          </w:tcPr>
-          <w:p>
-            <w:pPr>
-              <w:spacing w:after="0"/>
-            </w:pPr>
-            <w:r>
-              <w:rPr>
-                <w:sz w:val="18"/>
-              </w:rPr>
-              <w:t>Entry rules checked against the student's own grades, aptitude-test flags, the cut-off history and the official syllabus</w:t>
-            </w:r>
-          </w:p>
-        </w:tc>
-        <w:tc>
-          <w:tcPr>
-            <w:tcW w:w="3120" w:type="dxa"/>
-          </w:tcPr>
-          <w:p>
-            <w:pPr>
-              <w:spacing w:after="0"/>
-            </w:pPr>
-            <w:r>
-              <w:rPr>
-                <w:sz w:val="18"/>
-              </w:rPr>
-              <w:t>Ineligible choices; "what does this degree teach?"</w:t>
-            </w:r>
-          </w:p>
-        </w:tc>
-      </w:tr>
-      <w:tr>
-        <w:trPr>
-          <w:cantSplit/>
-        </w:trPr>
-        <w:tc>
-          <w:tcPr>
-            <w:tcW w:w="3120" w:type="dxa"/>
-          </w:tcPr>
-          <w:p>
-            <w:pPr>
-              <w:spacing w:after="0"/>
-            </w:pPr>
-            <w:r>
-              <w:rPr>
-                <w:sz w:val="18"/>
-              </w:rPr>
-              <w:t>My list</w:t>
-            </w:r>
-          </w:p>
-        </w:tc>
-        <w:tc>
-          <w:tcPr>
-            <w:tcW w:w="3120" w:type="dxa"/>
-          </w:tcPr>
-          <w:p>
-            <w:pPr>
-              <w:spacing w:after="0"/>
-            </w:pPr>
-            <w:r>
-              <w:rPr>
-                <w:sz w:val="18"/>
-              </w:rPr>
-              <w:t>The UGC preference list (up to 125 courses), with warnings when the order blocks a course the student wants more</w:t>
-            </w:r>
-          </w:p>
-        </w:tc>
-        <w:tc>
-          <w:tcPr>
-            <w:tcW w:w="3120" w:type="dxa"/>
-          </w:tcPr>
-          <w:p>
-            <w:pPr>
-              <w:spacing w:after="0"/>
-            </w:pPr>
-            <w:r>
-              <w:rPr>
-                <w:sz w:val="18"/>
-              </w:rPr>
-              <w:t>A badly ordered list</w:t>
-            </w:r>
-          </w:p>
-        </w:tc>
-      </w:tr>
-      <w:tr>
-        <w:trPr>
-          <w:cantSplit/>
-        </w:trPr>
-        <w:tc>
-          <w:tcPr>
-            <w:tcW w:w="3120" w:type="dxa"/>
-          </w:tcPr>
-          <w:p>
-            <w:pPr>
-              <w:spacing w:after="0"/>
-            </w:pPr>
-            <w:r>
-              <w:rPr>
-                <w:sz w:val="18"/>
-              </w:rPr>
-              <w:t>Compare</w:t>
-            </w:r>
-          </w:p>
-        </w:tc>
-        <w:tc>
-          <w:tcPr>
-            <w:tcW w:w="3120" w:type="dxa"/>
-          </w:tcPr>
-          <w:p>
-            <w:pPr>
-              <w:spacing w:after="0"/>
-            </w:pPr>
-            <w:r>
-              <w:rPr>
-                <w:sz w:val="18"/>
-              </w:rPr>
-              <w:t>Up to three courses side by side: chance, length, first-year subjects, extra steps</w:t>
-            </w:r>
-          </w:p>
-        </w:tc>
-        <w:tc>
-          <w:tcPr>
-            <w:tcW w:w="3120" w:type="dxa"/>
-          </w:tcPr>
-          <w:p>
-            <w:pPr>
-              <w:spacing w:after="0"/>
-            </w:pPr>
-            <w:r>
-              <w:rPr>
-                <w:sz w:val="18"/>
-              </w:rPr>
-              <w:t>Choosing between degrees blind</w:t>
-            </w:r>
-          </w:p>
-        </w:tc>
-      </w:tr>
-      <w:tr>
-        <w:trPr>
-          <w:cantSplit/>
-        </w:trPr>
-        <w:tc>
-          <w:tcPr>
-            <w:tcW w:w="3120" w:type="dxa"/>
-          </w:tcPr>
-          <w:p>
-            <w:pPr>
-              <w:spacing w:after="0"/>
-            </w:pPr>
-            <w:r>
-              <w:rPr>
-                <w:sz w:val="18"/>
-              </w:rPr>
-              <w:t>Ask ZedPath</w:t>
-            </w:r>
-          </w:p>
-        </w:tc>
-        <w:tc>
-          <w:tcPr>
-            <w:tcW w:w="3120" w:type="dxa"/>
-          </w:tcPr>
-          <w:p>
-            <w:pPr>
-              <w:spacing w:after="0"/>
-            </w:pPr>
-            <w:r>
-              <w:rPr>
-                <w:sz w:val="18"/>
-              </w:rPr>
-              <w:t>Questions answered in Sinhala, Tamil or English from the UGC handbook and official pages, each answer citing its page and linking to the official source to check; off-topic questions refused</w:t>
-            </w:r>
-          </w:p>
-        </w:tc>
-        <w:tc>
-          <w:tcPr>
-            <w:tcW w:w="3120" w:type="dxa"/>
-          </w:tcPr>
-          <w:p>
-            <w:pPr>
-              <w:spacing w:after="0"/>
-            </w:pPr>
-            <w:r>
-              <w:rPr>
-                <w:sz w:val="18"/>
-              </w:rPr>
-              <w:t>Hearsay and unreadable handbooks</w:t>
-            </w:r>
-          </w:p>
-        </w:tc>
-      </w:tr>
-      <w:tr>
-        <w:trPr>
-          <w:cantSplit/>
-        </w:trPr>
-        <w:tc>
-          <w:tcPr>
-            <w:tcW w:w="3120" w:type="dxa"/>
-          </w:tcPr>
-          <w:p>
-            <w:pPr>
-              <w:spacing w:after="0"/>
-            </w:pPr>
-            <w:r>
-              <w:rPr>
-                <w:sz w:val="18"/>
-              </w:rPr>
-              <w:t>Gazette alerts</w:t>
-            </w:r>
-          </w:p>
-        </w:tc>
-        <w:tc>
-          <w:tcPr>
-            <w:tcW w:w="3120" w:type="dxa"/>
-          </w:tcPr>
-          <w:p>
-            <w:pPr>
-              <w:spacing w:after="0"/>
-            </w:pPr>
-            <w:r>
-              <w:rPr>
-                <w:sz w:val="18"/>
-              </w:rPr>
-              <w:t>Every weekly Gazette read; a new job exam the student qualifies for becomes an alert with its closing date</w:t>
-            </w:r>
-          </w:p>
-        </w:tc>
-        <w:tc>
-          <w:tcPr>
-            <w:tcW w:w="3120" w:type="dxa"/>
-          </w:tcPr>
-          <w:p>
-            <w:pPr>
-              <w:spacing w:after="0"/>
-            </w:pPr>
-            <w:r>
-              <w:rPr>
-                <w:sz w:val="18"/>
-              </w:rPr>
-              <w:t>Missing job exams</w:t>
-            </w:r>
-          </w:p>
-        </w:tc>
-      </w:tr>
-      <w:tr>
-        <w:trPr>
-          <w:cantSplit/>
-        </w:trPr>
-        <w:tc>
-          <w:tcPr>
-            <w:tcW w:w="3120" w:type="dxa"/>
-          </w:tcPr>
-          <w:p>
-            <w:pPr>
-              <w:spacing w:after="0"/>
-            </w:pPr>
-            <w:r>
-              <w:rPr>
-                <w:sz w:val="18"/>
-              </w:rPr>
-              <w:t>Journey and reminders</w:t>
-            </w:r>
-          </w:p>
-        </w:tc>
-        <w:tc>
-          <w:tcPr>
-            <w:tcW w:w="3120" w:type="dxa"/>
-          </w:tcPr>
-          <w:p>
-            <w:pPr>
-              <w:spacing w:after="0"/>
-            </w:pPr>
-            <w:r>
-              <w:rPr>
-                <w:sz w:val="18"/>
-              </w:rPr>
-              <w:t>Every step from results to registration, marked confirmed or estimated, with reminders as phone notifications</w:t>
-            </w:r>
-          </w:p>
-        </w:tc>
-        <w:tc>
-          <w:tcPr>
-            <w:tcW w:w="3120" w:type="dxa"/>
-          </w:tcPr>
-          <w:p>
-            <w:pPr>
-              <w:spacing w:after="0"/>
-            </w:pPr>
-            <w:r>
-              <w:rPr>
-                <w:sz w:val="18"/>
-              </w:rPr>
-              <w:t>Missed windows and later rounds</w:t>
-            </w:r>
-          </w:p>
-        </w:tc>
-      </w:tr>
-      <w:tr>
-        <w:trPr>
-          <w:cantSplit/>
-        </w:trPr>
-        <w:tc>
-          <w:tcPr>
-            <w:tcW w:w="3120" w:type="dxa"/>
-          </w:tcPr>
-          <w:p>
-            <w:pPr>
-              <w:spacing w:after="0"/>
-            </w:pPr>
-            <w:r>
-              <w:rPr>
-                <w:sz w:val="18"/>
-              </w:rPr>
-              <w:t>Course groups</w:t>
-            </w:r>
-          </w:p>
-        </w:tc>
-        <w:tc>
-          <w:tcPr>
-            <w:tcW w:w="3120" w:type="dxa"/>
-          </w:tcPr>
-          <w:p>
-            <w:pPr>
-              <w:spacing w:after="0"/>
-            </w:pPr>
-            <w:r>
-              <w:rPr>
-                <w:sz w:val="18"/>
-              </w:rPr>
-              <w:t>A group per target course, verified seniors marked with a badge, report and block on every message</w:t>
-            </w:r>
-          </w:p>
-        </w:tc>
-        <w:tc>
-          <w:tcPr>
-            <w:tcW w:w="3120" w:type="dxa"/>
-          </w:tcPr>
-          <w:p>
-            <w:pPr>
-              <w:spacing w:after="0"/>
-            </w:pPr>
-            <w:r>
-              <w:rPr>
-                <w:sz w:val="18"/>
-              </w:rPr>
-              <w:t>Unverified Facebook advice</w:t>
-            </w:r>
-          </w:p>
-        </w:tc>
-      </w:tr>
-      <w:tr>
-        <w:trPr>
-          <w:cantSplit/>
-        </w:trPr>
-        <w:tc>
-          <w:tcPr>
-            <w:tcW w:w="3120" w:type="dxa"/>
-          </w:tcPr>
-          <w:p>
-            <w:pPr>
-              <w:spacing w:after="0"/>
-            </w:pPr>
-            <w:r>
-              <w:rPr>
-                <w:sz w:val="18"/>
-              </w:rPr>
-              <w:t>Three languages</w:t>
-            </w:r>
-          </w:p>
-        </w:tc>
-        <w:tc>
-          <w:tcPr>
-            <w:tcW w:w="3120" w:type="dxa"/>
-          </w:tcPr>
-          <w:p>
-            <w:pPr>
-              <w:spacing w:after="0"/>
-            </w:pPr>
-            <w:r>
-              <w:rPr>
-                <w:sz w:val="18"/>
-              </w:rPr>
-              <w:t>The whole interface in Sinhala, Tamil and English, reviewed by native speakers</w:t>
-            </w:r>
-          </w:p>
-        </w:tc>
-        <w:tc>
-          <w:tcPr>
-            <w:tcW w:w="3120" w:type="dxa"/>
-          </w:tcPr>
-          <w:p>
-            <w:pPr>
-              <w:spacing w:after="0"/>
-            </w:pPr>
-            <w:r>
-              <w:rPr>
-                <w:sz w:val="18"/>
-              </w:rPr>
-              <w:t>English-only tools</w:t>
-            </w:r>
-          </w:p>
-        </w:tc>
-      </w:tr>
-      <w:tr>
-        <w:trPr>
-          <w:cantSplit/>
-        </w:trPr>
-        <w:tc>
-          <w:tcPr>
-            <w:tcW w:w="3120" w:type="dxa"/>
-          </w:tcPr>
-          <w:p>
-            <w:pPr>
-              <w:spacing w:after="0"/>
-            </w:pPr>
-            <w:r>
-              <w:rPr>
-                <w:sz w:val="18"/>
-              </w:rPr>
               <w:t>Account</w:t>
             </w:r>
           </w:p>
@@ -1716,6 +1740,14 @@
       <w:r>
         <w:t>ZedPath runs in any phone browser, installs like an app, and ships as a native Android app with its own notifications.</w:t>
       </w:r>
+    </w:p>
+    <w:p>
+      <w:pPr>
+        <w:spacing w:after="80"/>
+        <w:rPr>
+          <w:b/>
+        </w:rPr>
+      </w:pPr>
     </w:p>
     <w:p>
       <w:pPr>
@@ -1735,8 +1767,16 @@
       <w:pPr>
         <w:pStyle w:val="Heading2"/>
         <w:keepLines/>
-      </w:pPr>
-      <w:r>
+        <w:rPr>
+          <w:sz w:val="32"/>
+          <w:szCs w:val="32"/>
+        </w:rPr>
+      </w:pPr>
+      <w:r>
+        <w:rPr>
+          <w:sz w:val="32"/>
+          <w:szCs w:val="32"/>
+        </w:rPr>
         <w:t>3. Target audience</w:t>
       </w:r>
     </w:p>
@@ -1756,7 +1796,6 @@
         <w:rPr>
           <w:noProof/>
         </w:rPr>
-        <w:lastRenderedPageBreak/>
         <w:drawing>
           <wp:inline distT="0" distB="0" distL="0" distR="0" wp14:anchorId="4C7082C3" wp14:editId="4C7082C4">
             <wp:extent cx="5486400" cy="2090057"/>
@@ -1771,7 +1810,7 @@
                     <pic:cNvPicPr/>
                   </pic:nvPicPr>
                   <pic:blipFill>
-                    <a:blip r:embed="rId5"/>
+                    <a:blip r:embed="rId6"/>
                     <a:stretch>
                       <a:fillRect/>
                     </a:stretch>
@@ -2511,32 +2550,49 @@
       <w:pPr>
         <w:pStyle w:val="Heading2"/>
         <w:keepLines/>
-      </w:pPr>
-      <w:r>
+        <w:rPr>
+          <w:sz w:val="32"/>
+          <w:szCs w:val="32"/>
+        </w:rPr>
+      </w:pPr>
+      <w:r>
+        <w:rPr>
+          <w:sz w:val="32"/>
+          <w:szCs w:val="32"/>
+        </w:rPr>
         <w:t>4. Value proposition</w:t>
       </w:r>
     </w:p>
     <w:p>
       <w:pPr>
         <w:spacing w:after="80"/>
-      </w:pPr>
-      <w:r>
         <w:rPr>
           <w:b/>
         </w:rPr>
+      </w:pPr>
+      <w:r>
+        <w:rPr>
+          <w:b/>
+        </w:rPr>
         <w:t>For students:</w:t>
       </w:r>
       <w:r>
         <w:t xml:space="preserve"> every path they can reach, checked against their own results, with the source behind every number, free. </w:t>
       </w:r>
+    </w:p>
+    <w:p>
+      <w:pPr>
+        <w:spacing w:after="80"/>
+      </w:pPr>
       <w:r>
         <w:rPr>
           <w:b/>
+          <w:bCs/>
         </w:rPr>
         <w:t>For sponsors:</w:t>
       </w:r>
       <w:r>
-        <w:t xml:space="preserve"> a trusted way to support students at the moment they decide, with their name never shown beside results or answers.</w:t>
+        <w:t xml:space="preserve"> a visible education CSR story ("helped 10,000 students plan their next step") and their name in front of students just as they open their first bank account or choose a mobile plan for university. Sponsors appear across the app, on the welcome screen, in reminders and in the Journey, but never inside an answer or a course ranking, so the advice stays neutral.</w:t>
       </w:r>
     </w:p>
     <w:p>
@@ -2545,7 +2601,6 @@
         <w:keepLines/>
       </w:pPr>
       <w:r>
-        <w:lastRenderedPageBreak/>
         <w:t>Against the alternatives</w:t>
       </w:r>
     </w:p>
@@ -3055,16 +3110,29 @@
     <w:p>
       <w:pPr>
         <w:spacing w:after="80"/>
-      </w:pPr>
-      <w:r>
         <w:rPr>
           <w:b/>
         </w:rPr>
+      </w:pPr>
+    </w:p>
+    <w:p>
+      <w:pPr>
+        <w:spacing w:after="80"/>
+      </w:pPr>
+      <w:r>
+        <w:rPr>
+          <w:b/>
+        </w:rPr>
         <w:t>ZedPath's edge</w:t>
       </w:r>
       <w:r>
         <w:t xml:space="preserve"> is the combination, and four things no tested tool does:</w:t>
       </w:r>
+    </w:p>
+    <w:p>
+      <w:pPr>
+        <w:spacing w:after="80"/>
+      </w:pPr>
     </w:p>
     <w:p>
       <w:pPr>
@@ -3101,7 +3169,19 @@
         <w:t>Checks the order.</w:t>
       </w:r>
       <w:r>
-        <w:t xml:space="preserve"> The preference list is tested against how selection actually works.</w:t>
+        <w:t xml:space="preserve"> The preference list is tested against how selection actually wo</w:t>
+      </w:r>
+      <w:r>
+        <w:t>r</w:t>
+      </w:r>
+      <w:r>
+        <w:t>k</w:t>
+      </w:r>
+      <w:r>
+        <w:t>s</w:t>
+      </w:r>
+      <w:r>
+        <w:t>.</w:t>
       </w:r>
     </w:p>
     <w:p>
@@ -3116,11 +3196,12 @@
       <w:r>
         <w:rPr>
           <w:b/>
-        </w:rPr>
-        <w:t>Covers paths outside the UGC.</w:t>
-      </w:r>
-      <w:r>
-        <w:t xml:space="preserve"> Private degrees, job exams, vocational courses, study abroad and more sit beside state courses.</w:t>
+          <w:bCs/>
+        </w:rPr>
+        <w:t>Covers personalized paths outside the UGC.</w:t>
+      </w:r>
+      <w:r>
+        <w:t xml:space="preserve"> Using the details each student gives when registering (stream, district, results, age and achievements), ZedPath checks which private degrees, job exams, vocational courses and study-abroad options they can apply for, and its AI assistant answers questions about them for that student.</w:t>
       </w:r>
     </w:p>
     <w:p>
@@ -3144,14 +3225,6 @@
     </w:p>
     <w:p>
       <w:pPr>
-        <w:spacing w:after="80"/>
-      </w:pPr>
-      <w:r>
-        <w:t>The defensible part is the data pipeline: the yearly handbook, five years of cut-offs and the weekly Gazette are turned into tested rules, each tied to its source page. A competitor would have to rebuild that pipeline and keep it current every year.</w:t>
-      </w:r>
-    </w:p>
-    <w:p>
-      <w:pPr>
         <w:pStyle w:val="Heading2"/>
         <w:keepLines/>
       </w:pPr>
@@ -3167,8 +3240,16 @@
         <w:pStyle w:val="Heading2"/>
         <w:keepLines/>
         <w:pageBreakBefore/>
-      </w:pPr>
-      <w:r>
+        <w:rPr>
+          <w:sz w:val="32"/>
+          <w:szCs w:val="32"/>
+        </w:rPr>
+      </w:pPr>
+      <w:r>
+        <w:rPr>
+          <w:sz w:val="32"/>
+          <w:szCs w:val="32"/>
+        </w:rPr>
         <w:lastRenderedPageBreak/>
         <w:t>5. Implementation</w:t>
       </w:r>
@@ -3177,8 +3258,16 @@
       <w:pPr>
         <w:pStyle w:val="Heading3"/>
         <w:keepLines/>
-      </w:pPr>
-      <w:r>
+        <w:rPr>
+          <w:sz w:val="28"/>
+          <w:szCs w:val="28"/>
+        </w:rPr>
+      </w:pPr>
+      <w:r>
+        <w:rPr>
+          <w:sz w:val="28"/>
+          <w:szCs w:val="28"/>
+        </w:rPr>
         <w:t>How it is built</w:t>
       </w:r>
     </w:p>
@@ -3212,7 +3301,7 @@
                     <pic:cNvPicPr/>
                   </pic:nvPicPr>
                   <pic:blipFill>
-                    <a:blip r:embed="rId6"/>
+                    <a:blip r:embed="rId7"/>
                     <a:stretch>
                       <a:fillRect/>
                     </a:stretch>
@@ -3340,8 +3429,16 @@
       <w:pPr>
         <w:pStyle w:val="Heading3"/>
         <w:keepLines/>
-      </w:pPr>
-      <w:r>
+        <w:rPr>
+          <w:sz w:val="28"/>
+          <w:szCs w:val="28"/>
+        </w:rPr>
+      </w:pPr>
+      <w:r>
+        <w:rPr>
+          <w:sz w:val="28"/>
+          <w:szCs w:val="28"/>
+        </w:rPr>
         <w:t>Go-to-market and roadmap</w:t>
       </w:r>
     </w:p>
@@ -3439,20 +3536,36 @@
         </w:rPr>
         <w:lastRenderedPageBreak/>
         <w:drawing>
-          <wp:inline distT="0" distB="0" distL="0" distR="0" wp14:anchorId="4C7082C7" wp14:editId="4C7082C8">
-            <wp:extent cx="5486400" cy="1812471"/>
+          <wp:anchor distT="0" distB="0" distL="114300" distR="114300" simplePos="0" relativeHeight="251659264" behindDoc="0" locked="0" layoutInCell="1" allowOverlap="1" wp14:anchorId="3E656F68" wp14:editId="2839502C">
+            <wp:simplePos x="0" y="0"/>
+            <wp:positionH relativeFrom="column">
+              <wp:posOffset>-163830</wp:posOffset>
+            </wp:positionH>
+            <wp:positionV relativeFrom="paragraph">
+              <wp:posOffset>-366395</wp:posOffset>
+            </wp:positionV>
+            <wp:extent cx="6332220" cy="2091690"/>
             <wp:effectExtent l="0" t="0" r="0" b="0"/>
-            <wp:docPr id="3" name="image3" descr="Roadmap to the 2027 admission cycle · phases and gates"/>
-            <wp:cNvGraphicFramePr/>
+            <wp:wrapSquare wrapText="bothSides"/>
+            <wp:docPr id="591797102" name="Picture 1"/>
+            <wp:cNvGraphicFramePr>
+              <a:graphicFrameLocks xmlns:a="http://schemas.openxmlformats.org/drawingml/2006/main" noChangeAspect="1"/>
+            </wp:cNvGraphicFramePr>
             <a:graphic xmlns:a="http://schemas.openxmlformats.org/drawingml/2006/main">
               <a:graphicData uri="http://schemas.openxmlformats.org/drawingml/2006/picture">
                 <pic:pic xmlns:pic="http://schemas.openxmlformats.org/drawingml/2006/picture">
                   <pic:nvPicPr>
-                    <pic:cNvPr id="3" name="image3" descr="Roadmap to the 2027 admission cycle · phases and gates"/>
+                    <pic:cNvPr id="591797102" name="Picture 591797102"/>
                     <pic:cNvPicPr/>
                   </pic:nvPicPr>
                   <pic:blipFill>
-                    <a:blip r:embed="rId7"/>
+                    <a:blip r:embed="rId8">
+                      <a:extLst>
+                        <a:ext uri="{28A0092B-C50C-407E-A947-70E740481C1C}">
+                          <a14:useLocalDpi xmlns:a14="http://schemas.microsoft.com/office/drawing/2010/main" val="0"/>
+                        </a:ext>
+                      </a:extLst>
+                    </a:blip>
                     <a:stretch>
                       <a:fillRect/>
                     </a:stretch>
@@ -3460,7 +3573,7 @@
                   <pic:spPr>
                     <a:xfrm>
                       <a:off x="0" y="0"/>
-                      <a:ext cx="5486400" cy="1812471"/>
+                      <a:ext cx="6332220" cy="2091690"/>
                     </a:xfrm>
                     <a:prstGeom prst="rect">
                       <a:avLst/>
@@ -3469,22 +3582,9 @@
                 </pic:pic>
               </a:graphicData>
             </a:graphic>
-          </wp:inline>
+          </wp:anchor>
         </w:drawing>
       </w:r>
-    </w:p>
-    <w:p>
-      <w:pPr>
-        <w:spacing w:after="80"/>
-      </w:pPr>
-      <w:r>
-        <w:t>Roadmap to the 2027 admission cycle · phases and gates</w:t>
-      </w:r>
-    </w:p>
-    <w:p>
-      <w:pPr>
-        <w:spacing w:after="80"/>
-      </w:pPr>
       <w:r>
         <w:t>Each cycle repeats with a new cohort, so the work of year one (rules pipeline, partners, channels) is reused every year.</w:t>
       </w:r>
@@ -3494,7 +3594,21 @@
         <w:pStyle w:val="Heading3"/>
         <w:keepLines/>
       </w:pPr>
-      <w:r>
+    </w:p>
+    <w:p>
+      <w:pPr>
+        <w:pStyle w:val="Heading3"/>
+        <w:keepLines/>
+        <w:rPr>
+          <w:sz w:val="28"/>
+          <w:szCs w:val="28"/>
+        </w:rPr>
+      </w:pPr>
+      <w:r>
+        <w:rPr>
+          <w:sz w:val="28"/>
+          <w:szCs w:val="28"/>
+        </w:rPr>
         <w:t>Business model and costs</w:t>
       </w:r>
     </w:p>
@@ -3504,7 +3618,10 @@
         <w:spacing w:after="80"/>
       </w:pPr>
       <w:r>
-        <w:t>ZedPath is funded from several small income streams, so no single partner decides its future. The core stays free for every student, and no stream can buy a higher place in a student's results.</w:t>
+        <w:t>Z</w:t>
+      </w:r>
+      <w:r>
+        <w:t>edPath is funded from several small income streams, so no single partner decides its future. The core stays free for every student, and no stream can buy a higher place in a student's results.</w:t>
       </w:r>
     </w:p>
     <w:tbl>
@@ -3732,75 +3849,6 @@
           </w:p>
         </w:tc>
       </w:tr>
-      <w:tr>
-        <w:trPr>
-          <w:cantSplit/>
-        </w:trPr>
-        <w:tc>
-          <w:tcPr>
-            <w:tcW w:w="2340" w:type="dxa"/>
-          </w:tcPr>
-          <w:p>
-            <w:pPr>
-              <w:spacing w:after="0"/>
-            </w:pPr>
-            <w:r>
-              <w:rPr>
-                <w:sz w:val="18"/>
-              </w:rPr>
-              <w:t>Demand reports for universities and policy makers (from year two)</w:t>
-            </w:r>
-          </w:p>
-        </w:tc>
-        <w:tc>
-          <w:tcPr>
-            <w:tcW w:w="2340" w:type="dxa"/>
-          </w:tcPr>
-          <w:p>
-            <w:pPr>
-              <w:spacing w:after="0"/>
-            </w:pPr>
-            <w:r>
-              <w:rPr>
-                <w:sz w:val="18"/>
-              </w:rPr>
-              <w:t>Aggregated, opt-in reports; never individual data, small groups suppressed</w:t>
-            </w:r>
-          </w:p>
-        </w:tc>
-        <w:tc>
-          <w:tcPr>
-            <w:tcW w:w="2340" w:type="dxa"/>
-          </w:tcPr>
-          <w:p>
-            <w:pPr>
-              <w:spacing w:after="0"/>
-            </w:pPr>
-            <w:r>
-              <w:rPr>
-                <w:sz w:val="18"/>
-              </w:rPr>
-              <w:t>LKR 50,000 per report</w:t>
-            </w:r>
-          </w:p>
-        </w:tc>
-        <w:tc>
-          <w:tcPr>
-            <w:tcW w:w="2340" w:type="dxa"/>
-          </w:tcPr>
-          <w:p>
-            <w:pPr>
-              <w:spacing w:after="0"/>
-            </w:pPr>
-            <w:r>
-              <w:rPr>
-                <w:sz w:val="18"/>
-              </w:rPr>
-              <w:t>0 in year one</w:t>
-            </w:r>
-          </w:p>
-        </w:tc>
-      </w:tr>
     </w:tbl>
     <w:p>
       <w:pPr>
@@ -4184,7 +4232,13 @@
       <w:pPr>
         <w:spacing w:after="80"/>
       </w:pPr>
-      <w:r>
+    </w:p>
+    <w:p>
+      <w:pPr>
+        <w:spacing w:after="80"/>
+      </w:pPr>
+      <w:r>
+        <w:lastRenderedPageBreak/>
         <w:t>That is about LKR 8 per student a year, of which AI answers are about LKR 4.60. Plus at 2% of students brings LKR 98,000, which covers year one's cost (LKR 78,100) with a margin. One CSR grant (LKR 100,000) funds the next cycle's growth, for LKR 198,000 in all.</w:t>
       </w:r>
     </w:p>
@@ -4192,8 +4246,16 @@
       <w:pPr>
         <w:pStyle w:val="Heading3"/>
         <w:keepLines/>
-      </w:pPr>
-      <w:r>
+        <w:rPr>
+          <w:sz w:val="28"/>
+          <w:szCs w:val="28"/>
+        </w:rPr>
+      </w:pPr>
+      <w:r>
+        <w:rPr>
+          <w:sz w:val="28"/>
+          <w:szCs w:val="28"/>
+        </w:rPr>
         <w:t>Risks and mitigations</w:t>
       </w:r>
     </w:p>
@@ -4705,8 +4767,16 @@
         <w:pStyle w:val="Heading2"/>
         <w:keepLines/>
         <w:pageBreakBefore/>
-      </w:pPr>
-      <w:r>
+        <w:rPr>
+          <w:sz w:val="32"/>
+          <w:szCs w:val="32"/>
+        </w:rPr>
+      </w:pPr>
+      <w:r>
+        <w:rPr>
+          <w:sz w:val="32"/>
+          <w:szCs w:val="32"/>
+        </w:rPr>
         <w:lastRenderedPageBreak/>
         <w:t>References</w:t>
       </w:r>
@@ -4754,7 +4824,7 @@
       <w:r>
         <w:t xml:space="preserve"> (student handbook): proposed intake per Uni-Code, entry rules, up to 125 preferences. </w:t>
       </w:r>
-      <w:hyperlink r:id="rId8" w:history="1">
+      <w:hyperlink r:id="rId9" w:history="1">
         <w:r>
           <w:rPr>
             <w:rStyle w:val="Hyperlink"/>
@@ -5670,7 +5740,6 @@
   <w:style w:type="character" w:default="1" w:styleId="DefaultParagraphFont">
     <w:name w:val="Default Paragraph Font"/>
     <w:uiPriority w:val="1"/>
-    <w:semiHidden/>
     <w:unhideWhenUsed/>
   </w:style>
   <w:style w:type="table" w:default="1" w:styleId="TableNormal">
@@ -6108,4 +6177,16 @@
     </a:ext>
   </a:extLst>
 </a:theme>
+</file>
+
+<file path=customXml/item1.xml><?xml version="1.0" encoding="utf-8"?>
+<b:Sources xmlns:b="http://schemas.openxmlformats.org/officeDocument/2006/bibliography" xmlns="http://schemas.openxmlformats.org/officeDocument/2006/bibliography" SelectedStyle="\APASixthEditionOfficeOnline.xsl" StyleName="APA" Version="6"/>
+</file>
+
+<file path=customXml/itemProps1.xml><?xml version="1.0" encoding="utf-8"?>
+<ds:datastoreItem xmlns:ds="http://schemas.openxmlformats.org/officeDocument/2006/customXml" ds:itemID="{549E1803-1905-4579-AD02-0BB2C50011B7}">
+  <ds:schemaRefs>
+    <ds:schemaRef ds:uri="http://schemas.openxmlformats.org/officeDocument/2006/bibliography"/>
+  </ds:schemaRefs>
+</ds:datastoreItem>
 </file>
</xml_diff>